<commit_message>
Manuscript v4: correct Xiao Xu gap counts and write the gaps as a limitation
The 64 undecidable labels are 56 on pages the digital Sibu congkan text
omits, 7 in juan 25 and 1 (詔); the limitations section now explains why
the 56 need a facsimile and treats the shared-label tests as a
robustness check.

Co-Authored-By: Claude Opus 5.5 (1M context) <noreply@anthropic.com>
Claude-Session: https://claude.ai/code/session_01DUE6qmVUYLALYANskiA97J
</commit_message>
<xml_diff>
--- a/youwen/manuscript/yisheng_paper_v4.docx
+++ b/youwen/manuscript/yisheng_paper_v4.docx
@@ -2709,7 +2709,7 @@
         <w:t xml:space="preserve">(臣鍇曰),</w:t>
       </w:r>
       <w:r>
-        <w:t xml:space="preserve"> was read for the label; the readings were made with an LLM-based assistant, and every quoted reading was checked against the text. Of the 212 labels, 100 appear in both recensions and 48 in the Dà Xú alone. The other 64 cannot be decided: 57 fall in lacunae of the digital text, six in juan 25, which the Xiǎo Xú lost and later supplied from the Dà Xú, and one, </w:t>
+        <w:t xml:space="preserve"> was read for the label; the readings were made with an LLM-based assistant, and every quoted reading was checked against the text. Of the 212 labels, 100 appear in both recensions and 48 in the Dà Xú alone. The other 64 cannot be decided: 56 fall on pages that the digital text omits in whole or in part, seven in juan 25, which the Xiǎo Xú lost and later supplied from the Dà Xú, and one, </w:t>
       </w:r>
       <w:r>
         <w:rPr>
@@ -2718,7 +2718,7 @@
         <w:t xml:space="preserve">詔,</w:t>
       </w:r>
       <w:r>
-        <w:t xml:space="preserve"> in an entry that seems to have been supplied the same way.</w:t>
+        <w:t xml:space="preserve"> whose Dà Xú-style fǎnqiè suggests that it was supplied the same way.</w:t>
       </w:r>
     </w:p>
     <w:bookmarkEnd w:id="15"/>
@@ -5962,7 +5962,24 @@
         <w:pStyle w:val="BodyText"/>
       </w:pPr>
       <w:r>
-        <w:t xml:space="preserve">Two caveats remain. The text is digital, with heuristically identified</w:t>
+        <w:t xml:space="preserve">The Xiǎo Xú evidence is incomplete, and most of the gap only a facsimile can fill. For eight of the 64 undecided labels no copy would help: seven stand in juan 25 and one </w:t>
+      </w:r>
+      <w:r>
+        <w:rPr>
+          <w:rFonts w:hint="eastAsia"/>
+        </w:rPr>
+        <w:t xml:space="preserve">(詔)</w:t>
+      </w:r>
+      <w:r>
+        <w:t xml:space="preserve"> in an entry apparently supplied from the Dà Xú, so the text there is the Dà Xú’s own. The other 56 fall on pages, scattered over 22 juan, that the digital Sibu congkan text omits in whole or in part, and no facsimile of the edition was available to us. The omissions are accidents of transcription, not of content. There is thus no obvious reason for these 56 labels to differ systematically from the 148 that could be collated, and the rows for shared labels in Tables 2, 4 and 5 are meant as a robustness check, not as a replacement for the main analysis. The collated readings, finally, were made with an LLM-based assistant; each one quoted here was checked against the text.</w:t>
+      </w:r>
+    </w:p>
+    <w:p>
+      <w:pPr>
+        <w:pStyle w:val="BodyText"/>
+      </w:pPr>
+      <w:r>
+        <w:t xml:space="preserve">Two caveats are easier to state. The Dà Xú text is digital, with heuristically identified</w:t>
       </w:r>
       <w:r>
         <w:t xml:space="preserve"> </w:t>
@@ -5975,7 +5992,7 @@
         <w:t xml:space="preserve">xīnfù</w:t>
       </w:r>
       <w:r>
-        <w:t xml:space="preserve">, and every cited form must be checked in print, above all against the 1963 Zhonghua facsimile of the Dà Xú. The Xiǎo Xú collation, moreover, rests on a digital text with lacunae, so 64 labels remain undecided until a facsimile is checked, and its readings, though each was verified against the text, were made with an LLM-based assistant. And because the hypotheses were refined after an exploratory look, every test is reported, the null for H1b and the unplanned decomposition of H1c included.</w:t>
+        <w:t xml:space="preserve">, and every cited form must be checked in print, above all against the 1963 Zhonghua facsimile. And because the hypotheses were refined after an exploratory look, every test is reported, the null for H1b and the unplanned decomposition of H1c included.</w:t>
       </w:r>
     </w:p>
     <w:bookmarkEnd w:id="32"/>

</xml_diff>